<commit_message>
update assignmentcwith all screenshots
</commit_message>
<xml_diff>
--- a/module-1/Peter Ddamulira - GitHub-Repository-Setup.docx
+++ b/module-1/Peter Ddamulira - GitHub-Repository-Setup.docx
@@ -227,7 +227,7 @@
           <w:shd w:val="clear" w:color="auto" w:fill="FFFFFF"/>
         </w:rPr>
         <w:drawing>
-          <wp:inline distT="0" distB="0" distL="0" distR="0" wp14:anchorId="295774E4" wp14:editId="32F08CD3">
+          <wp:inline distT="0" distB="0" distL="0" distR="0" wp14:anchorId="295774E4" wp14:editId="30C82097">
             <wp:extent cx="5943600" cy="3340100"/>
             <wp:effectExtent l="0" t="0" r="0" b="0"/>
             <wp:docPr id="1244865383" name="Picture 1"/>
@@ -257,6 +257,279 @@
                     <a:xfrm>
                       <a:off x="0" y="0"/>
                       <a:ext cx="5943600" cy="3340100"/>
+                    </a:xfrm>
+                    <a:prstGeom prst="rect">
+                      <a:avLst/>
+                    </a:prstGeom>
+                  </pic:spPr>
+                </pic:pic>
+              </a:graphicData>
+            </a:graphic>
+          </wp:inline>
+        </w:drawing>
+      </w:r>
+      <w:r>
+        <w:rPr>
+          <w:rFonts w:ascii="Open Sans" w:hAnsi="Open Sans" w:cs="Open Sans"/>
+          <w:b/>
+          <w:bCs/>
+          <w:color w:val="262626"/>
+          <w:sz w:val="21"/>
+          <w:szCs w:val="21"/>
+          <w:shd w:val="clear" w:color="auto" w:fill="FFFFFF"/>
+        </w:rPr>
+        <w:br/>
+      </w:r>
+      <w:r>
+        <w:rPr>
+          <w:rFonts w:ascii="Open Sans" w:hAnsi="Open Sans" w:cs="Open Sans"/>
+          <w:b/>
+          <w:bCs/>
+          <w:color w:val="262626"/>
+          <w:sz w:val="21"/>
+          <w:szCs w:val="21"/>
+          <w:shd w:val="clear" w:color="auto" w:fill="FFFFFF"/>
+        </w:rPr>
+        <w:br/>
+      </w:r>
+      <w:r>
+        <w:rPr>
+          <w:rFonts w:ascii="Open Sans" w:hAnsi="Open Sans" w:cs="Open Sans"/>
+          <w:b/>
+          <w:bCs/>
+          <w:noProof/>
+          <w:color w:val="262626"/>
+          <w:sz w:val="21"/>
+          <w:szCs w:val="21"/>
+          <w:shd w:val="clear" w:color="auto" w:fill="FFFFFF"/>
+        </w:rPr>
+        <w:lastRenderedPageBreak/>
+        <w:drawing>
+          <wp:inline distT="0" distB="0" distL="0" distR="0" wp14:anchorId="2CB50067" wp14:editId="75113917">
+            <wp:extent cx="5943600" cy="3352800"/>
+            <wp:effectExtent l="0" t="0" r="0" b="0"/>
+            <wp:docPr id="160233357" name="Picture 2"/>
+            <wp:cNvGraphicFramePr>
+              <a:graphicFrameLocks xmlns:a="http://schemas.openxmlformats.org/drawingml/2006/main" noChangeAspect="1"/>
+            </wp:cNvGraphicFramePr>
+            <a:graphic xmlns:a="http://schemas.openxmlformats.org/drawingml/2006/main">
+              <a:graphicData uri="http://schemas.openxmlformats.org/drawingml/2006/picture">
+                <pic:pic xmlns:pic="http://schemas.openxmlformats.org/drawingml/2006/picture">
+                  <pic:nvPicPr>
+                    <pic:cNvPr id="160233357" name="Picture 160233357"/>
+                    <pic:cNvPicPr/>
+                  </pic:nvPicPr>
+                  <pic:blipFill>
+                    <a:blip r:embed="rId5" cstate="print">
+                      <a:extLst>
+                        <a:ext uri="{28A0092B-C50C-407E-A947-70E740481C1C}">
+                          <a14:useLocalDpi xmlns:a14="http://schemas.microsoft.com/office/drawing/2010/main" val="0"/>
+                        </a:ext>
+                      </a:extLst>
+                    </a:blip>
+                    <a:stretch>
+                      <a:fillRect/>
+                    </a:stretch>
+                  </pic:blipFill>
+                  <pic:spPr>
+                    <a:xfrm>
+                      <a:off x="0" y="0"/>
+                      <a:ext cx="5943600" cy="3352800"/>
+                    </a:xfrm>
+                    <a:prstGeom prst="rect">
+                      <a:avLst/>
+                    </a:prstGeom>
+                  </pic:spPr>
+                </pic:pic>
+              </a:graphicData>
+            </a:graphic>
+          </wp:inline>
+        </w:drawing>
+      </w:r>
+      <w:r>
+        <w:rPr>
+          <w:rFonts w:ascii="Open Sans" w:hAnsi="Open Sans" w:cs="Open Sans"/>
+          <w:b/>
+          <w:bCs/>
+          <w:color w:val="262626"/>
+          <w:sz w:val="21"/>
+          <w:szCs w:val="21"/>
+          <w:shd w:val="clear" w:color="auto" w:fill="FFFFFF"/>
+        </w:rPr>
+        <w:br/>
+      </w:r>
+      <w:r>
+        <w:rPr>
+          <w:rFonts w:ascii="Open Sans" w:hAnsi="Open Sans" w:cs="Open Sans"/>
+          <w:b/>
+          <w:bCs/>
+          <w:color w:val="262626"/>
+          <w:sz w:val="21"/>
+          <w:szCs w:val="21"/>
+          <w:shd w:val="clear" w:color="auto" w:fill="FFFFFF"/>
+        </w:rPr>
+        <w:br/>
+      </w:r>
+      <w:r>
+        <w:rPr>
+          <w:rFonts w:ascii="Open Sans" w:hAnsi="Open Sans" w:cs="Open Sans"/>
+          <w:b/>
+          <w:bCs/>
+          <w:noProof/>
+          <w:color w:val="262626"/>
+          <w:sz w:val="21"/>
+          <w:szCs w:val="21"/>
+          <w:shd w:val="clear" w:color="auto" w:fill="FFFFFF"/>
+        </w:rPr>
+        <w:drawing>
+          <wp:inline distT="0" distB="0" distL="0" distR="0" wp14:anchorId="1A0336FE" wp14:editId="0DC6368C">
+            <wp:extent cx="5943600" cy="3349625"/>
+            <wp:effectExtent l="0" t="0" r="0" b="3175"/>
+            <wp:docPr id="1545440238" name="Picture 3"/>
+            <wp:cNvGraphicFramePr>
+              <a:graphicFrameLocks xmlns:a="http://schemas.openxmlformats.org/drawingml/2006/main" noChangeAspect="1"/>
+            </wp:cNvGraphicFramePr>
+            <a:graphic xmlns:a="http://schemas.openxmlformats.org/drawingml/2006/main">
+              <a:graphicData uri="http://schemas.openxmlformats.org/drawingml/2006/picture">
+                <pic:pic xmlns:pic="http://schemas.openxmlformats.org/drawingml/2006/picture">
+                  <pic:nvPicPr>
+                    <pic:cNvPr id="1545440238" name="Picture 1545440238"/>
+                    <pic:cNvPicPr/>
+                  </pic:nvPicPr>
+                  <pic:blipFill>
+                    <a:blip r:embed="rId6" cstate="print">
+                      <a:extLst>
+                        <a:ext uri="{28A0092B-C50C-407E-A947-70E740481C1C}">
+                          <a14:useLocalDpi xmlns:a14="http://schemas.microsoft.com/office/drawing/2010/main" val="0"/>
+                        </a:ext>
+                      </a:extLst>
+                    </a:blip>
+                    <a:stretch>
+                      <a:fillRect/>
+                    </a:stretch>
+                  </pic:blipFill>
+                  <pic:spPr>
+                    <a:xfrm>
+                      <a:off x="0" y="0"/>
+                      <a:ext cx="5943600" cy="3349625"/>
+                    </a:xfrm>
+                    <a:prstGeom prst="rect">
+                      <a:avLst/>
+                    </a:prstGeom>
+                  </pic:spPr>
+                </pic:pic>
+              </a:graphicData>
+            </a:graphic>
+          </wp:inline>
+        </w:drawing>
+      </w:r>
+      <w:r>
+        <w:rPr>
+          <w:rFonts w:ascii="Open Sans" w:hAnsi="Open Sans" w:cs="Open Sans"/>
+          <w:b/>
+          <w:bCs/>
+          <w:color w:val="262626"/>
+          <w:sz w:val="21"/>
+          <w:szCs w:val="21"/>
+          <w:shd w:val="clear" w:color="auto" w:fill="FFFFFF"/>
+        </w:rPr>
+        <w:br/>
+      </w:r>
+      <w:r>
+        <w:rPr>
+          <w:rFonts w:ascii="Open Sans" w:hAnsi="Open Sans" w:cs="Open Sans"/>
+          <w:b/>
+          <w:bCs/>
+          <w:noProof/>
+          <w:color w:val="262626"/>
+          <w:sz w:val="21"/>
+          <w:szCs w:val="21"/>
+          <w:shd w:val="clear" w:color="auto" w:fill="FFFFFF"/>
+        </w:rPr>
+        <w:lastRenderedPageBreak/>
+        <w:drawing>
+          <wp:inline distT="0" distB="0" distL="0" distR="0" wp14:anchorId="0F37141C" wp14:editId="553AE564">
+            <wp:extent cx="5943600" cy="2784475"/>
+            <wp:effectExtent l="0" t="0" r="0" b="0"/>
+            <wp:docPr id="1682812249" name="Picture 1"/>
+            <wp:cNvGraphicFramePr>
+              <a:graphicFrameLocks xmlns:a="http://schemas.openxmlformats.org/drawingml/2006/main" noChangeAspect="1"/>
+            </wp:cNvGraphicFramePr>
+            <a:graphic xmlns:a="http://schemas.openxmlformats.org/drawingml/2006/main">
+              <a:graphicData uri="http://schemas.openxmlformats.org/drawingml/2006/picture">
+                <pic:pic xmlns:pic="http://schemas.openxmlformats.org/drawingml/2006/picture">
+                  <pic:nvPicPr>
+                    <pic:cNvPr id="1682812249" name=""/>
+                    <pic:cNvPicPr/>
+                  </pic:nvPicPr>
+                  <pic:blipFill>
+                    <a:blip r:embed="rId7"/>
+                    <a:stretch>
+                      <a:fillRect/>
+                    </a:stretch>
+                  </pic:blipFill>
+                  <pic:spPr>
+                    <a:xfrm>
+                      <a:off x="0" y="0"/>
+                      <a:ext cx="5943600" cy="2784475"/>
+                    </a:xfrm>
+                    <a:prstGeom prst="rect">
+                      <a:avLst/>
+                    </a:prstGeom>
+                  </pic:spPr>
+                </pic:pic>
+              </a:graphicData>
+            </a:graphic>
+          </wp:inline>
+        </w:drawing>
+      </w:r>
+      <w:r>
+        <w:rPr>
+          <w:rFonts w:ascii="Open Sans" w:hAnsi="Open Sans" w:cs="Open Sans"/>
+          <w:b/>
+          <w:bCs/>
+          <w:color w:val="262626"/>
+          <w:sz w:val="21"/>
+          <w:szCs w:val="21"/>
+          <w:shd w:val="clear" w:color="auto" w:fill="FFFFFF"/>
+        </w:rPr>
+        <w:br/>
+      </w:r>
+      <w:r>
+        <w:rPr>
+          <w:rFonts w:ascii="Open Sans" w:hAnsi="Open Sans" w:cs="Open Sans"/>
+          <w:b/>
+          <w:bCs/>
+          <w:color w:val="262626"/>
+          <w:sz w:val="21"/>
+          <w:szCs w:val="21"/>
+          <w:shd w:val="clear" w:color="auto" w:fill="FFFFFF"/>
+        </w:rPr>
+        <w:drawing>
+          <wp:inline distT="0" distB="0" distL="0" distR="0" wp14:anchorId="38857E63" wp14:editId="6A2A5524">
+            <wp:extent cx="5943600" cy="2780030"/>
+            <wp:effectExtent l="0" t="0" r="0" b="1270"/>
+            <wp:docPr id="2138150013" name="Picture 1"/>
+            <wp:cNvGraphicFramePr>
+              <a:graphicFrameLocks xmlns:a="http://schemas.openxmlformats.org/drawingml/2006/main" noChangeAspect="1"/>
+            </wp:cNvGraphicFramePr>
+            <a:graphic xmlns:a="http://schemas.openxmlformats.org/drawingml/2006/main">
+              <a:graphicData uri="http://schemas.openxmlformats.org/drawingml/2006/picture">
+                <pic:pic xmlns:pic="http://schemas.openxmlformats.org/drawingml/2006/picture">
+                  <pic:nvPicPr>
+                    <pic:cNvPr id="2138150013" name=""/>
+                    <pic:cNvPicPr/>
+                  </pic:nvPicPr>
+                  <pic:blipFill>
+                    <a:blip r:embed="rId8"/>
+                    <a:stretch>
+                      <a:fillRect/>
+                    </a:stretch>
+                  </pic:blipFill>
+                  <pic:spPr>
+                    <a:xfrm>
+                      <a:off x="0" y="0"/>
+                      <a:ext cx="5943600" cy="2780030"/>
                     </a:xfrm>
                     <a:prstGeom prst="rect">
                       <a:avLst/>
@@ -881,6 +1154,7 @@
   <w:style w:type="character" w:default="1" w:styleId="DefaultParagraphFont">
     <w:name w:val="Default Paragraph Font"/>
     <w:uiPriority w:val="1"/>
+    <w:semiHidden/>
     <w:unhideWhenUsed/>
   </w:style>
   <w:style w:type="table" w:default="1" w:styleId="TableNormal">

</xml_diff>

<commit_message>
Update Module 1 assignment
</commit_message>
<xml_diff>
--- a/module-1/Peter Ddamulira - GitHub-Repository-Setup.docx
+++ b/module-1/Peter Ddamulira - GitHub-Repository-Setup.docx
@@ -227,7 +227,7 @@
           <w:shd w:val="clear" w:color="auto" w:fill="FFFFFF"/>
         </w:rPr>
         <w:drawing>
-          <wp:inline distT="0" distB="0" distL="0" distR="0" wp14:anchorId="295774E4" wp14:editId="32F08CD3">
+          <wp:inline distT="0" distB="0" distL="0" distR="0" wp14:anchorId="295774E4" wp14:editId="42D56779">
             <wp:extent cx="5943600" cy="3340100"/>
             <wp:effectExtent l="0" t="0" r="0" b="0"/>
             <wp:docPr id="1244865383" name="Picture 1"/>
@@ -257,6 +257,221 @@
                     <a:xfrm>
                       <a:off x="0" y="0"/>
                       <a:ext cx="5943600" cy="3340100"/>
+                    </a:xfrm>
+                    <a:prstGeom prst="rect">
+                      <a:avLst/>
+                    </a:prstGeom>
+                  </pic:spPr>
+                </pic:pic>
+              </a:graphicData>
+            </a:graphic>
+          </wp:inline>
+        </w:drawing>
+      </w:r>
+      <w:r>
+        <w:rPr>
+          <w:rFonts w:ascii="Open Sans" w:hAnsi="Open Sans" w:cs="Open Sans"/>
+          <w:b/>
+          <w:bCs/>
+          <w:color w:val="262626"/>
+          <w:sz w:val="21"/>
+          <w:szCs w:val="21"/>
+          <w:shd w:val="clear" w:color="auto" w:fill="FFFFFF"/>
+        </w:rPr>
+        <w:br/>
+      </w:r>
+      <w:r>
+        <w:rPr>
+          <w:rFonts w:ascii="Open Sans" w:hAnsi="Open Sans" w:cs="Open Sans"/>
+          <w:b/>
+          <w:bCs/>
+          <w:color w:val="262626"/>
+          <w:sz w:val="21"/>
+          <w:szCs w:val="21"/>
+          <w:shd w:val="clear" w:color="auto" w:fill="FFFFFF"/>
+        </w:rPr>
+        <w:br/>
+      </w:r>
+      <w:r>
+        <w:rPr>
+          <w:rFonts w:ascii="Open Sans" w:hAnsi="Open Sans" w:cs="Open Sans"/>
+          <w:b/>
+          <w:bCs/>
+          <w:noProof/>
+          <w:color w:val="262626"/>
+          <w:sz w:val="21"/>
+          <w:szCs w:val="21"/>
+          <w:shd w:val="clear" w:color="auto" w:fill="FFFFFF"/>
+        </w:rPr>
+        <w:lastRenderedPageBreak/>
+        <w:drawing>
+          <wp:inline distT="0" distB="0" distL="0" distR="0" wp14:anchorId="2CB50067" wp14:editId="4BBD93A1">
+            <wp:extent cx="5943600" cy="3352800"/>
+            <wp:effectExtent l="0" t="0" r="0" b="0"/>
+            <wp:docPr id="160233357" name="Picture 2"/>
+            <wp:cNvGraphicFramePr>
+              <a:graphicFrameLocks xmlns:a="http://schemas.openxmlformats.org/drawingml/2006/main" noChangeAspect="1"/>
+            </wp:cNvGraphicFramePr>
+            <a:graphic xmlns:a="http://schemas.openxmlformats.org/drawingml/2006/main">
+              <a:graphicData uri="http://schemas.openxmlformats.org/drawingml/2006/picture">
+                <pic:pic xmlns:pic="http://schemas.openxmlformats.org/drawingml/2006/picture">
+                  <pic:nvPicPr>
+                    <pic:cNvPr id="160233357" name="Picture 160233357"/>
+                    <pic:cNvPicPr/>
+                  </pic:nvPicPr>
+                  <pic:blipFill>
+                    <a:blip r:embed="rId5" cstate="print">
+                      <a:extLst>
+                        <a:ext uri="{28A0092B-C50C-407E-A947-70E740481C1C}">
+                          <a14:useLocalDpi xmlns:a14="http://schemas.microsoft.com/office/drawing/2010/main" val="0"/>
+                        </a:ext>
+                      </a:extLst>
+                    </a:blip>
+                    <a:stretch>
+                      <a:fillRect/>
+                    </a:stretch>
+                  </pic:blipFill>
+                  <pic:spPr>
+                    <a:xfrm>
+                      <a:off x="0" y="0"/>
+                      <a:ext cx="5943600" cy="3352800"/>
+                    </a:xfrm>
+                    <a:prstGeom prst="rect">
+                      <a:avLst/>
+                    </a:prstGeom>
+                  </pic:spPr>
+                </pic:pic>
+              </a:graphicData>
+            </a:graphic>
+          </wp:inline>
+        </w:drawing>
+      </w:r>
+      <w:r>
+        <w:rPr>
+          <w:rFonts w:ascii="Open Sans" w:hAnsi="Open Sans" w:cs="Open Sans"/>
+          <w:b/>
+          <w:bCs/>
+          <w:color w:val="262626"/>
+          <w:sz w:val="21"/>
+          <w:szCs w:val="21"/>
+          <w:shd w:val="clear" w:color="auto" w:fill="FFFFFF"/>
+        </w:rPr>
+        <w:br/>
+      </w:r>
+      <w:r>
+        <w:rPr>
+          <w:rFonts w:ascii="Open Sans" w:hAnsi="Open Sans" w:cs="Open Sans"/>
+          <w:b/>
+          <w:bCs/>
+          <w:color w:val="262626"/>
+          <w:sz w:val="21"/>
+          <w:szCs w:val="21"/>
+          <w:shd w:val="clear" w:color="auto" w:fill="FFFFFF"/>
+        </w:rPr>
+        <w:br/>
+      </w:r>
+      <w:r>
+        <w:rPr>
+          <w:rFonts w:ascii="Open Sans" w:hAnsi="Open Sans" w:cs="Open Sans"/>
+          <w:b/>
+          <w:bCs/>
+          <w:noProof/>
+          <w:color w:val="262626"/>
+          <w:sz w:val="21"/>
+          <w:szCs w:val="21"/>
+          <w:shd w:val="clear" w:color="auto" w:fill="FFFFFF"/>
+        </w:rPr>
+        <w:lastRenderedPageBreak/>
+        <w:drawing>
+          <wp:inline distT="0" distB="0" distL="0" distR="0" wp14:anchorId="1A0336FE" wp14:editId="0DC6368C">
+            <wp:extent cx="5943600" cy="3349625"/>
+            <wp:effectExtent l="0" t="0" r="0" b="3175"/>
+            <wp:docPr id="1545440238" name="Picture 3"/>
+            <wp:cNvGraphicFramePr>
+              <a:graphicFrameLocks xmlns:a="http://schemas.openxmlformats.org/drawingml/2006/main" noChangeAspect="1"/>
+            </wp:cNvGraphicFramePr>
+            <a:graphic xmlns:a="http://schemas.openxmlformats.org/drawingml/2006/main">
+              <a:graphicData uri="http://schemas.openxmlformats.org/drawingml/2006/picture">
+                <pic:pic xmlns:pic="http://schemas.openxmlformats.org/drawingml/2006/picture">
+                  <pic:nvPicPr>
+                    <pic:cNvPr id="1545440238" name="Picture 1545440238"/>
+                    <pic:cNvPicPr/>
+                  </pic:nvPicPr>
+                  <pic:blipFill>
+                    <a:blip r:embed="rId6" cstate="print">
+                      <a:extLst>
+                        <a:ext uri="{28A0092B-C50C-407E-A947-70E740481C1C}">
+                          <a14:useLocalDpi xmlns:a14="http://schemas.microsoft.com/office/drawing/2010/main" val="0"/>
+                        </a:ext>
+                      </a:extLst>
+                    </a:blip>
+                    <a:stretch>
+                      <a:fillRect/>
+                    </a:stretch>
+                  </pic:blipFill>
+                  <pic:spPr>
+                    <a:xfrm>
+                      <a:off x="0" y="0"/>
+                      <a:ext cx="5943600" cy="3349625"/>
+                    </a:xfrm>
+                    <a:prstGeom prst="rect">
+                      <a:avLst/>
+                    </a:prstGeom>
+                  </pic:spPr>
+                </pic:pic>
+              </a:graphicData>
+            </a:graphic>
+          </wp:inline>
+        </w:drawing>
+      </w:r>
+      <w:r>
+        <w:rPr>
+          <w:rFonts w:ascii="Open Sans" w:hAnsi="Open Sans" w:cs="Open Sans"/>
+          <w:b/>
+          <w:bCs/>
+          <w:color w:val="262626"/>
+          <w:sz w:val="21"/>
+          <w:szCs w:val="21"/>
+          <w:shd w:val="clear" w:color="auto" w:fill="FFFFFF"/>
+        </w:rPr>
+        <w:br/>
+      </w:r>
+      <w:r>
+        <w:rPr>
+          <w:rFonts w:ascii="Open Sans" w:hAnsi="Open Sans" w:cs="Open Sans"/>
+          <w:b/>
+          <w:bCs/>
+          <w:noProof/>
+          <w:color w:val="262626"/>
+          <w:sz w:val="21"/>
+          <w:szCs w:val="21"/>
+          <w:shd w:val="clear" w:color="auto" w:fill="FFFFFF"/>
+        </w:rPr>
+        <w:drawing>
+          <wp:inline distT="0" distB="0" distL="0" distR="0" wp14:anchorId="38857E63" wp14:editId="6A2A5524">
+            <wp:extent cx="5943600" cy="2780030"/>
+            <wp:effectExtent l="0" t="0" r="0" b="1270"/>
+            <wp:docPr id="2138150013" name="Picture 1"/>
+            <wp:cNvGraphicFramePr>
+              <a:graphicFrameLocks xmlns:a="http://schemas.openxmlformats.org/drawingml/2006/main" noChangeAspect="1"/>
+            </wp:cNvGraphicFramePr>
+            <a:graphic xmlns:a="http://schemas.openxmlformats.org/drawingml/2006/main">
+              <a:graphicData uri="http://schemas.openxmlformats.org/drawingml/2006/picture">
+                <pic:pic xmlns:pic="http://schemas.openxmlformats.org/drawingml/2006/picture">
+                  <pic:nvPicPr>
+                    <pic:cNvPr id="2138150013" name=""/>
+                    <pic:cNvPicPr/>
+                  </pic:nvPicPr>
+                  <pic:blipFill>
+                    <a:blip r:embed="rId7"/>
+                    <a:stretch>
+                      <a:fillRect/>
+                    </a:stretch>
+                  </pic:blipFill>
+                  <pic:spPr>
+                    <a:xfrm>
+                      <a:off x="0" y="0"/>
+                      <a:ext cx="5943600" cy="2780030"/>
                     </a:xfrm>
                     <a:prstGeom prst="rect">
                       <a:avLst/>
@@ -881,6 +1096,7 @@
   <w:style w:type="character" w:default="1" w:styleId="DefaultParagraphFont">
     <w:name w:val="Default Paragraph Font"/>
     <w:uiPriority w:val="1"/>
+    <w:semiHidden/>
     <w:unhideWhenUsed/>
   </w:style>
   <w:style w:type="table" w:default="1" w:styleId="TableNormal">

</xml_diff>